<commit_message>
docs(HU-01): quitar cabeceras con imagen y corregir gridSpan para Google Docs
- Se eliminan las cabeceras SENA (header2/3 con logo e imágenes): eran la
  causa principal de que Google Docs rompiera el formato al importar
- Se corrige el gridSpan en las filas de ancho completo ("Descripción:",
  "CRITERIOS DE ACEPTACIÓN") para que ocupen toda la tabla
- Resultado: 6 tablas simples con tblGrid, 0 vMerge, sin cabeceras
- Validado: zip íntegro y export a PDF con LibreOffice correcto (todo el
  contenido, las 5 condiciones, tareas y versiones)
</commit_message>
<xml_diff>
--- a/docs/historias_usuario/docx/HU-01-ConsultaInformacionPublica.docx
+++ b/docs/historias_usuario/docx/HU-01-ConsultaInformacionPublica.docx
@@ -428,6 +428,7 @@
         <w:tc>
           <w:tcPr>
             <w:tcW w:w="8984" w:type="dxa"/>
+            <w:gridSpan w:val="2"/>
             <w:tcBorders>
               <w:top w:val="single" w:sz="4" w:space="0" w:color="000000"/>
               <w:left w:val="single" w:sz="4" w:space="0" w:color="000000"/>
@@ -840,6 +841,7 @@
         <w:tc>
           <w:tcPr>
             <w:tcW w:w="8984" w:type="dxa"/>
+            <w:gridSpan w:val="3"/>
             <w:tcBorders>
               <w:top w:val="single" w:sz="4" w:space="0" w:color="000000"/>
               <w:left w:val="single" w:sz="4" w:space="0" w:color="000000"/>
@@ -3652,9 +3654,6 @@
       </w:tr>
     </w:tbl>
     <w:sectPr>
-      <w:headerReference w:type="even" r:id="rId2"/>
-      <w:headerReference w:type="default" r:id="rId3"/>
-      <w:headerReference w:type="first" r:id="rId4"/>
       <w:type w:val="nextPage"/>
       <w:pgSz w:w="12240" w:h="15840"/>
       <w:pgMar w:left="1701" w:right="1701" w:gutter="0" w:header="708" w:top="1414" w:footer="0" w:bottom="1417"/>
@@ -3665,667 +3664,6 @@
     </w:sectPr>
   </w:body>
 </w:document>
-</file>
-
-<file path=word/header1.xml><?xml version="1.0" encoding="utf-8"?>
-<w:hdr xmlns:o="urn:schemas-microsoft-com:office:office" xmlns:r="http://schemas.openxmlformats.org/officeDocument/2006/relationships" xmlns:v="urn:schemas-microsoft-com:vml" xmlns:w="http://schemas.openxmlformats.org/wordprocessingml/2006/main" xmlns:w10="urn:schemas-microsoft-com:office:word" xmlns:wp="http://schemas.openxmlformats.org/drawingml/2006/wordprocessingDrawing" xmlns:pic="http://schemas.openxmlformats.org/drawingml/2006/picture" xmlns:wps="http://schemas.microsoft.com/office/word/2010/wordprocessingShape" xmlns:wpg="http://schemas.microsoft.com/office/word/2010/wordprocessingGroup" xmlns:mc="http://schemas.openxmlformats.org/markup-compatibility/2006" xmlns:wp14="http://schemas.microsoft.com/office/word/2010/wordprocessingDrawing" xmlns:w14="http://schemas.microsoft.com/office/word/2010/wordml" xmlns:w15="http://schemas.microsoft.com/office/word/2012/wordml" mc:Ignorable="w14 wp14 w15">
-  <w:p>
-    <w:pPr>
-      <w:pStyle w:val="normal1"/>
-      <w:spacing w:before="0" w:after="160"/>
-      <w:rPr/>
-    </w:pPr>
-    <w:r>
-      <w:rPr/>
-    </w:r>
-  </w:p>
-</w:hdr>
-</file>
-
-<file path=word/header2.xml><?xml version="1.0" encoding="utf-8"?>
-<w:hdr xmlns:o="urn:schemas-microsoft-com:office:office" xmlns:r="http://schemas.openxmlformats.org/officeDocument/2006/relationships" xmlns:v="urn:schemas-microsoft-com:vml" xmlns:w="http://schemas.openxmlformats.org/wordprocessingml/2006/main" xmlns:w10="urn:schemas-microsoft-com:office:word" xmlns:wp="http://schemas.openxmlformats.org/drawingml/2006/wordprocessingDrawing" xmlns:pic="http://schemas.openxmlformats.org/drawingml/2006/picture" xmlns:wps="http://schemas.microsoft.com/office/word/2010/wordprocessingShape" xmlns:wpg="http://schemas.microsoft.com/office/word/2010/wordprocessingGroup" xmlns:mc="http://schemas.openxmlformats.org/markup-compatibility/2006" xmlns:wp14="http://schemas.microsoft.com/office/word/2010/wordprocessingDrawing" xmlns:w14="http://schemas.microsoft.com/office/word/2010/wordml" xmlns:w15="http://schemas.microsoft.com/office/word/2012/wordml" mc:Ignorable="w14 wp14 w15">
-  <w:p>
-    <w:pPr>
-      <w:pStyle w:val="normal1"/>
-      <w:keepNext w:val="false"/>
-      <w:keepLines w:val="false"/>
-      <w:widowControl/>
-      <w:pBdr/>
-      <w:shd w:val="clear" w:fill="auto"/>
-      <w:tabs>
-        <w:tab w:val="clear" w:pos="720"/>
-        <w:tab w:val="center" w:pos="4419" w:leader="none"/>
-        <w:tab w:val="right" w:pos="8838" w:leader="none"/>
-      </w:tabs>
-      <w:spacing w:lineRule="auto" w:line="240" w:before="0" w:after="0"/>
-      <w:ind w:hanging="0" w:left="0" w:right="0"/>
-      <w:jc w:val="left"/>
-      <w:rPr>
-        <w:rFonts w:ascii="Calibri" w:hAnsi="Calibri" w:eastAsia="Calibri" w:cs="Calibri"/>
-        <w:b w:val="false"/>
-        <w:i w:val="false"/>
-        <w:i w:val="false"/>
-        <w:caps w:val="false"/>
-        <w:smallCaps w:val="false"/>
-        <w:strike w:val="false"/>
-        <w:dstrike w:val="false"/>
-        <w:color w:val="000000"/>
-        <w:position w:val="0"/>
-        <w:sz w:val="22"/>
-        <w:sz w:val="22"/>
-        <w:szCs w:val="22"/>
-        <w:u w:val="none"/>
-        <w:shd w:fill="auto" w:val="clear"/>
-        <w:vertAlign w:val="baseline"/>
-      </w:rPr>
-    </w:pPr>
-    <w:r>
-      <w:rPr>
-        <w:rFonts w:eastAsia="Calibri" w:cs="Calibri"/>
-        <w:b w:val="false"/>
-        <w:i w:val="false"/>
-        <w:caps w:val="false"/>
-        <w:smallCaps w:val="false"/>
-        <w:strike w:val="false"/>
-        <w:dstrike w:val="false"/>
-        <w:color w:val="000000"/>
-        <w:position w:val="0"/>
-        <w:sz w:val="22"/>
-        <w:sz w:val="22"/>
-        <w:szCs w:val="22"/>
-        <w:u w:val="none"/>
-        <w:shd w:fill="auto" w:val="clear"/>
-        <w:vertAlign w:val="baseline"/>
-      </w:rPr>
-      <w:t xml:space="preserve">                                      </w:t>
-    </w:r>
-  </w:p>
-  <w:tbl>
-    <w:tblPr>
-      <w:tblW w:w="8794" w:type="dxa"/>
-      <w:jc w:val="left"/>
-      <w:tblInd w:w="38" w:type="dxa"/>
-      <w:tblLayout w:type="fixed"/>
-      <w:tblCellMar>
-        <w:top w:w="55" w:type="dxa"/>
-        <w:left w:w="55" w:type="dxa"/>
-        <w:bottom w:w="55" w:type="dxa"/>
-        <w:right w:w="55" w:type="dxa"/>
-      </w:tblCellMar>
-    </w:tblPr>
-    <w:tblGrid>
-      <w:gridCol w:w="2034"/>
-      <w:gridCol w:w="5447"/>
-      <w:gridCol w:w="1313"/>
-    </w:tblGrid>
-    <w:tr>
-      <w:trPr/>
-      <w:tc>
-        <w:tcPr>
-          <w:tcW w:w="2034" w:type="dxa"/>
-          <w:tcBorders>
-            <w:top w:val="single" w:sz="4" w:space="0" w:color="000000"/>
-            <w:left w:val="single" w:sz="4" w:space="0" w:color="000000"/>
-            <w:bottom w:val="single" w:sz="4" w:space="0" w:color="000000"/>
-          </w:tcBorders>
-        </w:tcPr>
-        <w:p>
-          <w:pPr>
-            <w:pStyle w:val="TableContents"/>
-            <w:spacing w:before="0" w:after="160"/>
-            <w:jc w:val="center"/>
-            <w:rPr>
-              <w:rFonts w:ascii="Calibri" w:hAnsi="Calibri" w:eastAsia="Calibri" w:cs="Calibri"/>
-              <w:sz w:val="22"/>
-              <w:szCs w:val="22"/>
-            </w:rPr>
-          </w:pPr>
-          <w:r>
-            <w:rPr>
-              <w:rFonts w:eastAsia="Calibri" w:cs="Calibri"/>
-              <w:sz w:val="22"/>
-              <w:szCs w:val="22"/>
-            </w:rPr>
-            <w:drawing>
-              <wp:anchor behindDoc="0" distT="0" distB="0" distL="0" distR="0" simplePos="0" locked="0" layoutInCell="0" allowOverlap="1" relativeHeight="2">
-                <wp:simplePos x="0" y="0"/>
-                <wp:positionH relativeFrom="column">
-                  <wp:posOffset>205740</wp:posOffset>
-                </wp:positionH>
-                <wp:positionV relativeFrom="paragraph">
-                  <wp:posOffset>635</wp:posOffset>
-                </wp:positionV>
-                <wp:extent cx="515620" cy="306705"/>
-                <wp:effectExtent l="0" t="0" r="0" b="0"/>
-                <wp:wrapSquare wrapText="largest"/>
-                <wp:docPr id="1" name="Image1" descr=""/>
-                <wp:cNvGraphicFramePr>
-                  <a:graphicFrameLocks xmlns:a="http://schemas.openxmlformats.org/drawingml/2006/main" noChangeAspect="1"/>
-                </wp:cNvGraphicFramePr>
-                <a:graphic xmlns:a="http://schemas.openxmlformats.org/drawingml/2006/main">
-                  <a:graphicData uri="http://schemas.openxmlformats.org/drawingml/2006/picture">
-                    <pic:pic xmlns:pic="http://schemas.openxmlformats.org/drawingml/2006/picture">
-                      <pic:nvPicPr>
-                        <pic:cNvPr id="1" name="Image1" descr=""/>
-                        <pic:cNvPicPr>
-                          <a:picLocks noChangeAspect="1" noChangeArrowheads="1"/>
-                        </pic:cNvPicPr>
-                      </pic:nvPicPr>
-                      <pic:blipFill>
-                        <a:blip r:embed="rId1"/>
-                        <a:stretch>
-                          <a:fillRect/>
-                        </a:stretch>
-                      </pic:blipFill>
-                      <pic:spPr bwMode="auto">
-                        <a:xfrm>
-                          <a:off x="0" y="0"/>
-                          <a:ext cx="515620" cy="306705"/>
-                        </a:xfrm>
-                        <a:prstGeom prst="rect">
-                          <a:avLst/>
-                        </a:prstGeom>
-                        <a:noFill/>
-                      </pic:spPr>
-                    </pic:pic>
-                  </a:graphicData>
-                </a:graphic>
-              </wp:anchor>
-            </w:drawing>
-          </w:r>
-        </w:p>
-      </w:tc>
-      <w:tc>
-        <w:tcPr>
-          <w:tcW w:w="5447" w:type="dxa"/>
-          <w:tcBorders>
-            <w:top w:val="single" w:sz="4" w:space="0" w:color="000000"/>
-            <w:left w:val="single" w:sz="4" w:space="0" w:color="000000"/>
-            <w:bottom w:val="single" w:sz="4" w:space="0" w:color="000000"/>
-          </w:tcBorders>
-        </w:tcPr>
-        <w:p>
-          <w:pPr>
-            <w:pStyle w:val="TableContents"/>
-            <w:spacing w:before="0" w:after="160"/>
-            <w:jc w:val="center"/>
-            <w:rPr>
-              <w:rFonts w:ascii="Calibri" w:hAnsi="Calibri" w:eastAsia="Calibri" w:cs="Calibri"/>
-              <w:sz w:val="22"/>
-              <w:szCs w:val="22"/>
-            </w:rPr>
-          </w:pPr>
-          <w:r>
-            <w:rPr>
-              <w:rFonts w:eastAsia="Calibri" w:cs="Calibri"/>
-              <w:sz w:val="22"/>
-              <w:szCs w:val="22"/>
-            </w:rPr>
-            <w:t>SERVICIO NACIONAL DE APRENDIZAJE</w:t>
-          </w:r>
-        </w:p>
-      </w:tc>
-      <w:tc>
-        <w:tcPr>
-          <w:tcW w:w="1313" w:type="dxa"/>
-          <w:tcBorders>
-            <w:top w:val="single" w:sz="4" w:space="0" w:color="000000"/>
-            <w:left w:val="single" w:sz="4" w:space="0" w:color="000000"/>
-            <w:bottom w:val="single" w:sz="4" w:space="0" w:color="000000"/>
-            <w:right w:val="single" w:sz="4" w:space="0" w:color="000000"/>
-          </w:tcBorders>
-        </w:tcPr>
-        <w:p>
-          <w:pPr>
-            <w:pStyle w:val="TableContents"/>
-            <w:spacing w:before="0" w:after="160"/>
-            <w:rPr>
-              <w:rFonts w:ascii="Calibri" w:hAnsi="Calibri" w:eastAsia="Calibri" w:cs="Calibri"/>
-              <w:sz w:val="22"/>
-              <w:szCs w:val="22"/>
-            </w:rPr>
-          </w:pPr>
-          <w:r>
-            <w:rPr>
-              <w:rFonts w:eastAsia="Calibri" w:cs="Calibri"/>
-              <w:sz w:val="22"/>
-              <w:szCs w:val="22"/>
-            </w:rPr>
-            <w:t>Version 1.0</w:t>
-          </w:r>
-        </w:p>
-      </w:tc>
-    </w:tr>
-  </w:tbl>
-  <w:p>
-    <w:pPr>
-      <w:pStyle w:val="normal1"/>
-      <w:widowControl/>
-      <w:pBdr/>
-      <w:shd w:val="clear" w:fill="auto"/>
-      <w:tabs>
-        <w:tab w:val="clear" w:pos="720"/>
-        <w:tab w:val="center" w:pos="4419" w:leader="none"/>
-        <w:tab w:val="right" w:pos="8838" w:leader="none"/>
-      </w:tabs>
-      <w:spacing w:lineRule="auto" w:line="240" w:before="0" w:after="0"/>
-      <w:ind w:hanging="0" w:left="0" w:right="0"/>
-      <w:jc w:val="left"/>
-      <w:rPr>
-        <w:rFonts w:ascii="Calibri" w:hAnsi="Calibri" w:eastAsia="Calibri" w:cs="Calibri"/>
-        <w:b w:val="false"/>
-        <w:i w:val="false"/>
-        <w:i w:val="false"/>
-        <w:caps w:val="false"/>
-        <w:smallCaps w:val="false"/>
-        <w:strike w:val="false"/>
-        <w:dstrike w:val="false"/>
-        <w:color w:val="000000"/>
-        <w:position w:val="0"/>
-        <w:sz w:val="22"/>
-        <w:sz w:val="22"/>
-        <w:szCs w:val="22"/>
-        <w:u w:val="none"/>
-        <w:shd w:fill="auto" w:val="clear"/>
-        <w:vertAlign w:val="baseline"/>
-      </w:rPr>
-    </w:pPr>
-    <w:r>
-      <w:rPr>
-        <w:rFonts w:eastAsia="Calibri" w:cs="Calibri"/>
-        <w:b w:val="false"/>
-        <w:i w:val="false"/>
-        <w:caps w:val="false"/>
-        <w:smallCaps w:val="false"/>
-        <w:strike w:val="false"/>
-        <w:dstrike w:val="false"/>
-        <w:color w:val="000000"/>
-        <w:sz w:val="22"/>
-        <w:szCs w:val="22"/>
-        <w:u w:val="none"/>
-        <w:shd w:fill="auto" w:val="clear"/>
-      </w:rPr>
-    </w:r>
-  </w:p>
-  <w:p>
-    <w:pPr>
-      <w:pStyle w:val="normal1"/>
-      <w:keepNext w:val="false"/>
-      <w:keepLines w:val="false"/>
-      <w:widowControl/>
-      <w:pBdr/>
-      <w:shd w:val="clear" w:fill="auto"/>
-      <w:tabs>
-        <w:tab w:val="clear" w:pos="720"/>
-        <w:tab w:val="center" w:pos="4419" w:leader="none"/>
-        <w:tab w:val="right" w:pos="8838" w:leader="none"/>
-      </w:tabs>
-      <w:spacing w:lineRule="auto" w:line="240" w:before="0" w:after="0"/>
-      <w:ind w:hanging="0" w:left="0" w:right="0"/>
-      <w:jc w:val="left"/>
-      <w:rPr>
-        <w:rFonts w:ascii="Calibri" w:hAnsi="Calibri" w:eastAsia="Calibri" w:cs="Calibri"/>
-        <w:b w:val="false"/>
-        <w:i w:val="false"/>
-        <w:i w:val="false"/>
-        <w:caps w:val="false"/>
-        <w:smallCaps w:val="false"/>
-        <w:strike w:val="false"/>
-        <w:dstrike w:val="false"/>
-        <w:color w:val="000000"/>
-        <w:position w:val="0"/>
-        <w:sz w:val="22"/>
-        <w:sz w:val="22"/>
-        <w:szCs w:val="22"/>
-        <w:u w:val="none"/>
-        <w:shd w:fill="auto" w:val="clear"/>
-        <w:vertAlign w:val="baseline"/>
-      </w:rPr>
-    </w:pPr>
-    <w:r>
-      <w:rPr>
-        <w:rFonts w:eastAsia="Calibri" w:cs="Calibri"/>
-        <w:b w:val="false"/>
-        <w:i w:val="false"/>
-        <w:caps w:val="false"/>
-        <w:smallCaps w:val="false"/>
-        <w:strike w:val="false"/>
-        <w:dstrike w:val="false"/>
-        <w:color w:val="000000"/>
-        <w:position w:val="0"/>
-        <w:sz w:val="22"/>
-        <w:sz w:val="22"/>
-        <w:szCs w:val="22"/>
-        <w:u w:val="none"/>
-        <w:shd w:fill="auto" w:val="clear"/>
-        <w:vertAlign w:val="baseline"/>
-      </w:rPr>
-    </w:r>
-  </w:p>
-</w:hdr>
-</file>
-
-<file path=word/header3.xml><?xml version="1.0" encoding="utf-8"?>
-<w:hdr xmlns:o="urn:schemas-microsoft-com:office:office" xmlns:r="http://schemas.openxmlformats.org/officeDocument/2006/relationships" xmlns:v="urn:schemas-microsoft-com:vml" xmlns:w="http://schemas.openxmlformats.org/wordprocessingml/2006/main" xmlns:w10="urn:schemas-microsoft-com:office:word" xmlns:wp="http://schemas.openxmlformats.org/drawingml/2006/wordprocessingDrawing" xmlns:pic="http://schemas.openxmlformats.org/drawingml/2006/picture" xmlns:wps="http://schemas.microsoft.com/office/word/2010/wordprocessingShape" xmlns:wpg="http://schemas.microsoft.com/office/word/2010/wordprocessingGroup" xmlns:mc="http://schemas.openxmlformats.org/markup-compatibility/2006" xmlns:wp14="http://schemas.microsoft.com/office/word/2010/wordprocessingDrawing" xmlns:w14="http://schemas.microsoft.com/office/word/2010/wordml" xmlns:w15="http://schemas.microsoft.com/office/word/2012/wordml" mc:Ignorable="w14 wp14 w15">
-  <w:p>
-    <w:pPr>
-      <w:pStyle w:val="normal1"/>
-      <w:keepNext w:val="false"/>
-      <w:keepLines w:val="false"/>
-      <w:widowControl/>
-      <w:pBdr/>
-      <w:shd w:val="clear" w:fill="auto"/>
-      <w:tabs>
-        <w:tab w:val="clear" w:pos="720"/>
-        <w:tab w:val="center" w:pos="4419" w:leader="none"/>
-        <w:tab w:val="right" w:pos="8838" w:leader="none"/>
-      </w:tabs>
-      <w:spacing w:lineRule="auto" w:line="240" w:before="0" w:after="0"/>
-      <w:ind w:hanging="0" w:left="0" w:right="0"/>
-      <w:jc w:val="left"/>
-      <w:rPr>
-        <w:rFonts w:ascii="Calibri" w:hAnsi="Calibri" w:eastAsia="Calibri" w:cs="Calibri"/>
-        <w:b w:val="false"/>
-        <w:i w:val="false"/>
-        <w:i w:val="false"/>
-        <w:caps w:val="false"/>
-        <w:smallCaps w:val="false"/>
-        <w:strike w:val="false"/>
-        <w:dstrike w:val="false"/>
-        <w:color w:val="000000"/>
-        <w:position w:val="0"/>
-        <w:sz w:val="22"/>
-        <w:sz w:val="22"/>
-        <w:szCs w:val="22"/>
-        <w:u w:val="none"/>
-        <w:shd w:fill="auto" w:val="clear"/>
-        <w:vertAlign w:val="baseline"/>
-      </w:rPr>
-    </w:pPr>
-    <w:r>
-      <w:rPr>
-        <w:rFonts w:eastAsia="Calibri" w:cs="Calibri"/>
-        <w:b w:val="false"/>
-        <w:i w:val="false"/>
-        <w:caps w:val="false"/>
-        <w:smallCaps w:val="false"/>
-        <w:strike w:val="false"/>
-        <w:dstrike w:val="false"/>
-        <w:color w:val="000000"/>
-        <w:position w:val="0"/>
-        <w:sz w:val="22"/>
-        <w:sz w:val="22"/>
-        <w:szCs w:val="22"/>
-        <w:u w:val="none"/>
-        <w:shd w:fill="auto" w:val="clear"/>
-        <w:vertAlign w:val="baseline"/>
-      </w:rPr>
-      <w:t xml:space="preserve">                                      </w:t>
-    </w:r>
-  </w:p>
-  <w:tbl>
-    <w:tblPr>
-      <w:tblW w:w="8794" w:type="dxa"/>
-      <w:jc w:val="left"/>
-      <w:tblInd w:w="38" w:type="dxa"/>
-      <w:tblLayout w:type="fixed"/>
-      <w:tblCellMar>
-        <w:top w:w="55" w:type="dxa"/>
-        <w:left w:w="55" w:type="dxa"/>
-        <w:bottom w:w="55" w:type="dxa"/>
-        <w:right w:w="55" w:type="dxa"/>
-      </w:tblCellMar>
-    </w:tblPr>
-    <w:tblGrid>
-      <w:gridCol w:w="2034"/>
-      <w:gridCol w:w="5447"/>
-      <w:gridCol w:w="1313"/>
-    </w:tblGrid>
-    <w:tr>
-      <w:trPr/>
-      <w:tc>
-        <w:tcPr>
-          <w:tcW w:w="2034" w:type="dxa"/>
-          <w:tcBorders>
-            <w:top w:val="single" w:sz="4" w:space="0" w:color="000000"/>
-            <w:left w:val="single" w:sz="4" w:space="0" w:color="000000"/>
-            <w:bottom w:val="single" w:sz="4" w:space="0" w:color="000000"/>
-          </w:tcBorders>
-        </w:tcPr>
-        <w:p>
-          <w:pPr>
-            <w:pStyle w:val="TableContents"/>
-            <w:spacing w:before="0" w:after="160"/>
-            <w:jc w:val="center"/>
-            <w:rPr>
-              <w:rFonts w:ascii="Calibri" w:hAnsi="Calibri" w:eastAsia="Calibri" w:cs="Calibri"/>
-              <w:sz w:val="22"/>
-              <w:szCs w:val="22"/>
-            </w:rPr>
-          </w:pPr>
-          <w:r>
-            <w:rPr>
-              <w:rFonts w:eastAsia="Calibri" w:cs="Calibri"/>
-              <w:sz w:val="22"/>
-              <w:szCs w:val="22"/>
-            </w:rPr>
-            <w:drawing>
-              <wp:anchor behindDoc="0" distT="0" distB="0" distL="0" distR="0" simplePos="0" locked="0" layoutInCell="0" allowOverlap="1" relativeHeight="2">
-                <wp:simplePos x="0" y="0"/>
-                <wp:positionH relativeFrom="column">
-                  <wp:posOffset>205740</wp:posOffset>
-                </wp:positionH>
-                <wp:positionV relativeFrom="paragraph">
-                  <wp:posOffset>635</wp:posOffset>
-                </wp:positionV>
-                <wp:extent cx="515620" cy="306705"/>
-                <wp:effectExtent l="0" t="0" r="0" b="0"/>
-                <wp:wrapSquare wrapText="largest"/>
-                <wp:docPr id="2" name="Image1" descr=""/>
-                <wp:cNvGraphicFramePr>
-                  <a:graphicFrameLocks xmlns:a="http://schemas.openxmlformats.org/drawingml/2006/main" noChangeAspect="1"/>
-                </wp:cNvGraphicFramePr>
-                <a:graphic xmlns:a="http://schemas.openxmlformats.org/drawingml/2006/main">
-                  <a:graphicData uri="http://schemas.openxmlformats.org/drawingml/2006/picture">
-                    <pic:pic xmlns:pic="http://schemas.openxmlformats.org/drawingml/2006/picture">
-                      <pic:nvPicPr>
-                        <pic:cNvPr id="2" name="Image1" descr=""/>
-                        <pic:cNvPicPr>
-                          <a:picLocks noChangeAspect="1" noChangeArrowheads="1"/>
-                        </pic:cNvPicPr>
-                      </pic:nvPicPr>
-                      <pic:blipFill>
-                        <a:blip r:embed="rId1"/>
-                        <a:stretch>
-                          <a:fillRect/>
-                        </a:stretch>
-                      </pic:blipFill>
-                      <pic:spPr bwMode="auto">
-                        <a:xfrm>
-                          <a:off x="0" y="0"/>
-                          <a:ext cx="515620" cy="306705"/>
-                        </a:xfrm>
-                        <a:prstGeom prst="rect">
-                          <a:avLst/>
-                        </a:prstGeom>
-                        <a:noFill/>
-                      </pic:spPr>
-                    </pic:pic>
-                  </a:graphicData>
-                </a:graphic>
-              </wp:anchor>
-            </w:drawing>
-          </w:r>
-        </w:p>
-      </w:tc>
-      <w:tc>
-        <w:tcPr>
-          <w:tcW w:w="5447" w:type="dxa"/>
-          <w:tcBorders>
-            <w:top w:val="single" w:sz="4" w:space="0" w:color="000000"/>
-            <w:left w:val="single" w:sz="4" w:space="0" w:color="000000"/>
-            <w:bottom w:val="single" w:sz="4" w:space="0" w:color="000000"/>
-          </w:tcBorders>
-        </w:tcPr>
-        <w:p>
-          <w:pPr>
-            <w:pStyle w:val="TableContents"/>
-            <w:spacing w:before="0" w:after="160"/>
-            <w:jc w:val="center"/>
-            <w:rPr>
-              <w:rFonts w:ascii="Calibri" w:hAnsi="Calibri" w:eastAsia="Calibri" w:cs="Calibri"/>
-              <w:sz w:val="22"/>
-              <w:szCs w:val="22"/>
-            </w:rPr>
-          </w:pPr>
-          <w:r>
-            <w:rPr>
-              <w:rFonts w:eastAsia="Calibri" w:cs="Calibri"/>
-              <w:sz w:val="22"/>
-              <w:szCs w:val="22"/>
-            </w:rPr>
-            <w:t>SERVICIO NACIONAL DE APRENDIZAJE</w:t>
-          </w:r>
-        </w:p>
-      </w:tc>
-      <w:tc>
-        <w:tcPr>
-          <w:tcW w:w="1313" w:type="dxa"/>
-          <w:tcBorders>
-            <w:top w:val="single" w:sz="4" w:space="0" w:color="000000"/>
-            <w:left w:val="single" w:sz="4" w:space="0" w:color="000000"/>
-            <w:bottom w:val="single" w:sz="4" w:space="0" w:color="000000"/>
-            <w:right w:val="single" w:sz="4" w:space="0" w:color="000000"/>
-          </w:tcBorders>
-        </w:tcPr>
-        <w:p>
-          <w:pPr>
-            <w:pStyle w:val="TableContents"/>
-            <w:spacing w:before="0" w:after="160"/>
-            <w:rPr>
-              <w:rFonts w:ascii="Calibri" w:hAnsi="Calibri" w:eastAsia="Calibri" w:cs="Calibri"/>
-              <w:sz w:val="22"/>
-              <w:szCs w:val="22"/>
-            </w:rPr>
-          </w:pPr>
-          <w:r>
-            <w:rPr>
-              <w:rFonts w:eastAsia="Calibri" w:cs="Calibri"/>
-              <w:sz w:val="22"/>
-              <w:szCs w:val="22"/>
-            </w:rPr>
-            <w:t>Version 1.0</w:t>
-          </w:r>
-        </w:p>
-      </w:tc>
-    </w:tr>
-  </w:tbl>
-  <w:p>
-    <w:pPr>
-      <w:pStyle w:val="normal1"/>
-      <w:widowControl/>
-      <w:pBdr/>
-      <w:shd w:val="clear" w:fill="auto"/>
-      <w:tabs>
-        <w:tab w:val="clear" w:pos="720"/>
-        <w:tab w:val="center" w:pos="4419" w:leader="none"/>
-        <w:tab w:val="right" w:pos="8838" w:leader="none"/>
-      </w:tabs>
-      <w:spacing w:lineRule="auto" w:line="240" w:before="0" w:after="0"/>
-      <w:ind w:hanging="0" w:left="0" w:right="0"/>
-      <w:jc w:val="left"/>
-      <w:rPr>
-        <w:rFonts w:ascii="Calibri" w:hAnsi="Calibri" w:eastAsia="Calibri" w:cs="Calibri"/>
-        <w:b w:val="false"/>
-        <w:i w:val="false"/>
-        <w:i w:val="false"/>
-        <w:caps w:val="false"/>
-        <w:smallCaps w:val="false"/>
-        <w:strike w:val="false"/>
-        <w:dstrike w:val="false"/>
-        <w:color w:val="000000"/>
-        <w:position w:val="0"/>
-        <w:sz w:val="22"/>
-        <w:sz w:val="22"/>
-        <w:szCs w:val="22"/>
-        <w:u w:val="none"/>
-        <w:shd w:fill="auto" w:val="clear"/>
-        <w:vertAlign w:val="baseline"/>
-      </w:rPr>
-    </w:pPr>
-    <w:r>
-      <w:rPr>
-        <w:rFonts w:eastAsia="Calibri" w:cs="Calibri"/>
-        <w:b w:val="false"/>
-        <w:i w:val="false"/>
-        <w:caps w:val="false"/>
-        <w:smallCaps w:val="false"/>
-        <w:strike w:val="false"/>
-        <w:dstrike w:val="false"/>
-        <w:color w:val="000000"/>
-        <w:sz w:val="22"/>
-        <w:szCs w:val="22"/>
-        <w:u w:val="none"/>
-        <w:shd w:fill="auto" w:val="clear"/>
-      </w:rPr>
-    </w:r>
-  </w:p>
-  <w:p>
-    <w:pPr>
-      <w:pStyle w:val="normal1"/>
-      <w:keepNext w:val="false"/>
-      <w:keepLines w:val="false"/>
-      <w:widowControl/>
-      <w:pBdr/>
-      <w:shd w:val="clear" w:fill="auto"/>
-      <w:tabs>
-        <w:tab w:val="clear" w:pos="720"/>
-        <w:tab w:val="center" w:pos="4419" w:leader="none"/>
-        <w:tab w:val="right" w:pos="8838" w:leader="none"/>
-      </w:tabs>
-      <w:spacing w:lineRule="auto" w:line="240" w:before="0" w:after="0"/>
-      <w:ind w:hanging="0" w:left="0" w:right="0"/>
-      <w:jc w:val="left"/>
-      <w:rPr>
-        <w:rFonts w:ascii="Calibri" w:hAnsi="Calibri" w:eastAsia="Calibri" w:cs="Calibri"/>
-        <w:b w:val="false"/>
-        <w:i w:val="false"/>
-        <w:i w:val="false"/>
-        <w:caps w:val="false"/>
-        <w:smallCaps w:val="false"/>
-        <w:strike w:val="false"/>
-        <w:dstrike w:val="false"/>
-        <w:color w:val="000000"/>
-        <w:position w:val="0"/>
-        <w:sz w:val="22"/>
-        <w:sz w:val="22"/>
-        <w:szCs w:val="22"/>
-        <w:u w:val="none"/>
-        <w:shd w:fill="auto" w:val="clear"/>
-        <w:vertAlign w:val="baseline"/>
-      </w:rPr>
-    </w:pPr>
-    <w:r>
-      <w:rPr>
-        <w:rFonts w:eastAsia="Calibri" w:cs="Calibri"/>
-        <w:b w:val="false"/>
-        <w:i w:val="false"/>
-        <w:caps w:val="false"/>
-        <w:smallCaps w:val="false"/>
-        <w:strike w:val="false"/>
-        <w:dstrike w:val="false"/>
-        <w:color w:val="000000"/>
-        <w:position w:val="0"/>
-        <w:sz w:val="22"/>
-        <w:sz w:val="22"/>
-        <w:szCs w:val="22"/>
-        <w:u w:val="none"/>
-        <w:shd w:fill="auto" w:val="clear"/>
-        <w:vertAlign w:val="baseline"/>
-      </w:rPr>
-    </w:r>
-  </w:p>
-</w:hdr>
 </file>
 
 <file path=word/styles.xml><?xml version="1.0" encoding="utf-8"?>

</xml_diff>

<commit_message>
docs(HU): conservar tblPr+tblGrid en los DOCX (fix importación en Google Docs)
- El script de relleno descartaba la cabecera de la tabla (<w:tblPr> y
  <w:tblGrid>), por lo que las copias perdían la definición de columnas y
  Google Docs las desalineaba; la plantilla original sí la conserva
- Se regeneran las 29 historias (HU-01..HU-32) preservando tblPr + tblGrid
  (misma estructura que la plantilla oficial, que importa bien en Google Docs)
- Validado: todas tienen tblGrid/tblPr, zip íntegro y abren en LibreOffice
</commit_message>
<xml_diff>
--- a/docs/historias_usuario/docx/HU-01-ConsultaInformacionPublica.docx
+++ b/docs/historias_usuario/docx/HU-01-ConsultaInformacionPublica.docx
@@ -54,6 +54,31 @@
       </w:r>
     </w:p>
     <w:tbl>
+      <w:tblPr>
+        <w:tblStyle w:val="Table1"/>
+        <w:tblW w:w="8985" w:type="dxa"/>
+        <w:jc w:val="left"/>
+        <w:tblInd w:w="-108" w:type="dxa"/>
+        <w:tblLayout w:type="fixed"/>
+        <w:tblCellMar>
+          <w:top w:w="0" w:type="dxa"/>
+          <w:left w:w="108" w:type="dxa"/>
+          <w:bottom w:w="0" w:type="dxa"/>
+          <w:right w:w="108" w:type="dxa"/>
+        </w:tblCellMar>
+        <w:tblLook w:val="0400"/>
+      </w:tblPr>
+      <w:tblGrid>
+        <w:gridCol w:w="1140"/>
+        <w:gridCol w:w="51"/>
+        <w:gridCol w:w="918"/>
+        <w:gridCol w:w="171"/>
+        <w:gridCol w:w="1209"/>
+        <w:gridCol w:w="216"/>
+        <w:gridCol w:w="1650"/>
+        <w:gridCol w:w="1785"/>
+        <w:gridCol w:w="1844"/>
+      </w:tblGrid>
       <w:tr>
         <w:trPr/>
         <w:tc>
@@ -4856,7 +4881,7 @@
             </w:pPr>
             <w:r>
               <w:rPr/>
-              <w:t xml:space="preserve">Implementar el catálogo de productos con nombre, descripción, principio activo y presentación</w:t>
+              <w:t xml:space="preserve">Implementar el catálogo de productos con nombre, descripción, principio activo y presentación, sin datos internos</w:t>
             </w:r>
           </w:p>
         </w:tc>
@@ -5530,7 +5555,7 @@
             </w:pPr>
             <w:r>
               <w:rPr/>
-              <w:t xml:space="preserve">1.0</w:t>
+              <w:t xml:space="preserve">Versión</w:t>
             </w:r>
           </w:p>
         </w:tc>
@@ -5577,7 +5602,7 @@
             </w:pPr>
             <w:r>
               <w:rPr/>
-              <w:t xml:space="preserve">2026-08-06</w:t>
+              <w:t xml:space="preserve">Fecha</w:t>
             </w:r>
           </w:p>
         </w:tc>
@@ -5714,7 +5739,7 @@
             </w:pPr>
             <w:r>
               <w:rPr/>
-              <w:t xml:space="preserve">Revisión de lenguaje y criterios detallados</w:t>
+              <w:t xml:space="preserve">Descripción</w:t>
             </w:r>
           </w:p>
         </w:tc>

</xml_diff>